<commit_message>
Add backup retention and migration reconciliation
Prune only verified, unprotected routine backups while preserving recovery and migration safety copies. Reconcile interrupted legacy migrations with ownership checks and readiness-aware completion. Update Windows backup callers, packaging, tests, and documentation.
</commit_message>
<xml_diff>
--- a/docs/user-guides/windows/04-ConfigureCloudBackupFolderInOrchidAppForWindows.docx
+++ b/docs/user-guides/windows/04-ConfigureCloudBackupFolderInOrchidAppForWindows.docx
@@ -174,12 +174,10 @@
     <w:p>
       <w:proofErr w:type="spellStart"/>
       <w:r>
-        <w:t>OrchidApp</w:t>
+        <w:t>OrchidApp normally keeps three verified routine backups locally. Protected recovery copies and unrecognised files can increase that count.</w:t>
       </w:r>
       <w:proofErr w:type="spellEnd"/>
-      <w:r>
-        <w:t xml:space="preserve"> keeps local backups on the computer.</w:t>
-      </w:r>
+      <w:r/>
     </w:p>
     <w:p>
       <w:r>

</xml_diff>

<commit_message>
Add backup retention and migration reconciliation (#349)
Prune only verified, unprotected routine backups while preserving recovery and migration safety copies. Reconcile interrupted legacy migrations with ownership checks and readiness-aware completion. Update Windows backup callers, packaging, tests, and documentation.
</commit_message>
<xml_diff>
--- a/docs/user-guides/windows/04-ConfigureCloudBackupFolderInOrchidAppForWindows.docx
+++ b/docs/user-guides/windows/04-ConfigureCloudBackupFolderInOrchidAppForWindows.docx
@@ -174,12 +174,10 @@
     <w:p>
       <w:proofErr w:type="spellStart"/>
       <w:r>
-        <w:t>OrchidApp</w:t>
+        <w:t>OrchidApp normally keeps three verified routine backups locally. Protected recovery copies and unrecognised files can increase that count.</w:t>
       </w:r>
       <w:proofErr w:type="spellEnd"/>
-      <w:r>
-        <w:t xml:space="preserve"> keeps local backups on the computer.</w:t>
-      </w:r>
+      <w:r/>
     </w:p>
     <w:p>
       <w:r>

</xml_diff>